<commit_message>
docs/update contents & festival
</commit_message>
<xml_diff>
--- a/기획서_1부_행사기획서.docx
+++ b/기획서_1부_행사기획서.docx
@@ -40,7 +40,7 @@
           <w:color w:val="888888"/>
           <w:sz w:val="18"/>
         </w:rPr>
-        <w:t>2026년 3월  |  v0.1 초안  |  대외 제출용</w:t>
+        <w:t>2026년 3월  |  v0.2  |  대외 제출용</w:t>
       </w:r>
     </w:p>
     <w:p/>
@@ -3572,7 +3572,7 @@
                 <w:b w:val="0"/>
                 <w:sz w:val="20"/>
               </w:rPr>
-              <w:t>미정</w:t>
+              <w:t>✅ Python 3.11+ / C++17</w:t>
             </w:r>
           </w:p>
         </w:tc>

</xml_diff>